<commit_message>
Cập nhật OBJECTIVE và Position (13/7/2021).
</commit_message>
<xml_diff>
--- a/resume/nguyenduybang.docx
+++ b/resume/nguyenduybang.docx
@@ -1,6 +1,6 @@
 
 <file path=word/document.xml><?xml version="1.0" encoding="utf-8"?>
-<w:document xmlns:wpc="http://schemas.microsoft.com/office/word/2010/wordprocessingCanvas" xmlns:cx="http://schemas.microsoft.com/office/drawing/2014/chartex" xmlns:mc="http://schemas.openxmlformats.org/markup-compatibility/2006" xmlns:o="urn:schemas-microsoft-com:office:office" xmlns:r="http://schemas.openxmlformats.org/officeDocument/2006/relationships" xmlns:m="http://schemas.openxmlformats.org/officeDocument/2006/math" xmlns:v="urn:schemas-microsoft-com:vml" xmlns:wp14="http://schemas.microsoft.com/office/word/2010/wordprocessingDrawing" xmlns:wp="http://schemas.openxmlformats.org/drawingml/2006/wordprocessingDrawing" xmlns:w10="urn:schemas-microsoft-com:office:word" xmlns:w="http://schemas.openxmlformats.org/wordprocessingml/2006/main" xmlns:w14="http://schemas.microsoft.com/office/word/2010/wordml" xmlns:w15="http://schemas.microsoft.com/office/word/2012/wordml" xmlns:w16se="http://schemas.microsoft.com/office/word/2015/wordml/symex" xmlns:wpg="http://schemas.microsoft.com/office/word/2010/wordprocessingGroup" xmlns:wpi="http://schemas.microsoft.com/office/word/2010/wordprocessingInk" xmlns:wne="http://schemas.microsoft.com/office/word/2006/wordml" xmlns:wps="http://schemas.microsoft.com/office/word/2010/wordprocessingShape" mc:Ignorable="w14 w15 w16se wp14">
+<w:document xmlns:wpc="http://schemas.microsoft.com/office/word/2010/wordprocessingCanvas" xmlns:cx="http://schemas.microsoft.com/office/drawing/2014/chartex" xmlns:cx1="http://schemas.microsoft.com/office/drawing/2015/9/8/chartex" xmlns:cx2="http://schemas.microsoft.com/office/drawing/2015/10/21/chartex" xmlns:cx3="http://schemas.microsoft.com/office/drawing/2016/5/9/chartex" xmlns:cx4="http://schemas.microsoft.com/office/drawing/2016/5/10/chartex" xmlns:cx5="http://schemas.microsoft.com/office/drawing/2016/5/11/chartex" xmlns:cx6="http://schemas.microsoft.com/office/drawing/2016/5/12/chartex" xmlns:cx7="http://schemas.microsoft.com/office/drawing/2016/5/13/chartex" xmlns:cx8="http://schemas.microsoft.com/office/drawing/2016/5/14/chartex" xmlns:mc="http://schemas.openxmlformats.org/markup-compatibility/2006" xmlns:aink="http://schemas.microsoft.com/office/drawing/2016/ink" xmlns:am3d="http://schemas.microsoft.com/office/drawing/2017/model3d" xmlns:o="urn:schemas-microsoft-com:office:office" xmlns:r="http://schemas.openxmlformats.org/officeDocument/2006/relationships" xmlns:m="http://schemas.openxmlformats.org/officeDocument/2006/math" xmlns:v="urn:schemas-microsoft-com:vml" xmlns:wp14="http://schemas.microsoft.com/office/word/2010/wordprocessingDrawing" xmlns:wp="http://schemas.openxmlformats.org/drawingml/2006/wordprocessingDrawing" xmlns:w10="urn:schemas-microsoft-com:office:word" xmlns:w="http://schemas.openxmlformats.org/wordprocessingml/2006/main" xmlns:w14="http://schemas.microsoft.com/office/word/2010/wordml" xmlns:w15="http://schemas.microsoft.com/office/word/2012/wordml" xmlns:w16cex="http://schemas.microsoft.com/office/word/2018/wordml/cex" xmlns:w16cid="http://schemas.microsoft.com/office/word/2016/wordml/cid" xmlns:w16="http://schemas.microsoft.com/office/word/2018/wordml" xmlns:w16se="http://schemas.microsoft.com/office/word/2015/wordml/symex" xmlns:wpg="http://schemas.microsoft.com/office/word/2010/wordprocessingGroup" xmlns:wpi="http://schemas.microsoft.com/office/word/2010/wordprocessingInk" xmlns:wne="http://schemas.microsoft.com/office/word/2006/wordml" xmlns:wps="http://schemas.microsoft.com/office/word/2010/wordprocessingShape" mc:Ignorable="w14 w15 w16se w16cid w16 w16cex wp14">
   <w:body>
     <w:p>
       <w:pPr>
@@ -21,7 +21,7 @@
         <mc:AlternateContent>
           <mc:Choice Requires="wps">
             <w:drawing>
-              <wp:anchor distT="91440" distB="91440" distL="137160" distR="137160" simplePos="0" relativeHeight="251663360" behindDoc="0" locked="0" layoutInCell="1" allowOverlap="1" wp14:anchorId="0C9F86E2" wp14:editId="5F06432C">
+              <wp:anchor distT="91440" distB="91440" distL="137160" distR="137160" simplePos="0" relativeHeight="251663360" behindDoc="0" locked="0" layoutInCell="1" allowOverlap="1" wp14:anchorId="0526AB90" wp14:editId="37906CC9">
                 <wp:simplePos x="0" y="0"/>
                 <wp:positionH relativeFrom="margin">
                   <wp:posOffset>3048000</wp:posOffset>
@@ -116,7 +116,7 @@
           </mc:Choice>
           <mc:Fallback>
             <w:pict>
-              <v:shapetype w14:anchorId="0C9F86E2" id="_x0000_t202" coordsize="21600,21600" o:spt="202" path="m,l,21600r21600,l21600,xe">
+              <v:shapetype w14:anchorId="0526AB90" id="_x0000_t202" coordsize="21600,21600" o:spt="202" path="m,l,21600r21600,l21600,xe">
                 <v:stroke joinstyle="miter"/>
                 <v:path gradientshapeok="t" o:connecttype="rect"/>
               </v:shapetype>
@@ -166,7 +166,7 @@
         <mc:AlternateContent>
           <mc:Choice Requires="wpg">
             <w:drawing>
-              <wp:anchor distT="0" distB="0" distL="114300" distR="114300" simplePos="0" relativeHeight="251659264" behindDoc="0" locked="0" layoutInCell="1" allowOverlap="1" wp14:anchorId="74DFDDBE" wp14:editId="4B4ABFAE">
+              <wp:anchor distT="0" distB="0" distL="114300" distR="114300" simplePos="0" relativeHeight="251659264" behindDoc="0" locked="0" layoutInCell="1" allowOverlap="1" wp14:anchorId="3AAA1AB6" wp14:editId="2ACF7ABB">
                 <wp:simplePos x="0" y="0"/>
                 <wp:positionH relativeFrom="column">
                   <wp:posOffset>-914400</wp:posOffset>
@@ -1179,7 +1179,7 @@
           </mc:Choice>
           <mc:Fallback>
             <w:pict>
-              <v:group w14:anchorId="74DFDDBE" id="Group 24" o:spid="_x0000_s1027" style="position:absolute;margin-left:-1in;margin-top:-92.4pt;width:614.8pt;height:187.25pt;z-index:251659264;mso-width-relative:margin;mso-height-relative:margin" coordorigin=",-2571" coordsize="78085,23780" o:gfxdata="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">
+              <v:group w14:anchorId="3AAA1AB6" id="Group 24" o:spid="_x0000_s1027" style="position:absolute;margin-left:-1in;margin-top:-92.4pt;width:614.8pt;height:187.25pt;z-index:251659264;mso-width-relative:margin;mso-height-relative:margin" coordorigin=",-2571" coordsize="78085,23780" o:gfxdata="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">
                 <v:shapetype id="_x0000_t75" coordsize="21600,21600" o:spt="75" o:preferrelative="t" path="m@4@5l@4@11@9@11@9@5xe" filled="f" stroked="f">
                   <v:stroke joinstyle="miter"/>
                   <v:formulas>
@@ -1484,7 +1484,7 @@
           <w:szCs w:val="20"/>
         </w:rPr>
         <w:drawing>
-          <wp:anchor distT="0" distB="0" distL="114300" distR="114300" simplePos="0" relativeHeight="251661312" behindDoc="0" locked="0" layoutInCell="1" allowOverlap="1" wp14:anchorId="0DA84138" wp14:editId="0ADAAE01">
+          <wp:anchor distT="0" distB="0" distL="114300" distR="114300" simplePos="0" relativeHeight="251661312" behindDoc="0" locked="0" layoutInCell="1" allowOverlap="1" wp14:anchorId="74A41DC4" wp14:editId="5716CD21">
             <wp:simplePos x="0" y="0"/>
             <wp:positionH relativeFrom="column">
               <wp:posOffset>-824865</wp:posOffset>
@@ -1682,8 +1682,6 @@
             </w:r>
           </w:p>
         </w:tc>
-        <w:bookmarkStart w:id="0" w:name="_GoBack"/>
-        <w:bookmarkEnd w:id="0"/>
       </w:tr>
       <w:tr>
         <w:trPr>
@@ -1875,7 +1873,7 @@
                 <w:rFonts w:ascii="Courier New" w:hAnsi="Courier New" w:cs="Courier New"/>
                 <w:color w:val="3F3F3F"/>
               </w:rPr>
-              <w:t xml:space="preserve">- I want to learn more about knowlege, work experiences and will become an excellent engineer - projectmanager in the next 5 years. </w:t>
+              <w:t>- In the next five years, I want to study more about information and job experiences so that I may become an exceptional engineer-project manager.</w:t>
             </w:r>
           </w:p>
           <w:p>
@@ -1893,7 +1891,7 @@
                 <w:rFonts w:ascii="Courier New" w:hAnsi="Courier New" w:cs="Courier New"/>
                 <w:color w:val="3F3F3F"/>
               </w:rPr>
-              <w:t>- Worked in the dynamic environment, many promotion opportunities and can long-term commitment to thefirm where I can develop skills to contribute for company.</w:t>
+              <w:t>- Worked in a fast-paced atmosphere with several advancement chances and the ability to make a long-term commitment to a company where I can learn new skills and contribute to the company's success.</w:t>
             </w:r>
           </w:p>
         </w:tc>
@@ -1997,21 +1995,7 @@
                 <w:rFonts w:ascii="Courier New" w:hAnsi="Courier New" w:cs="Courier New"/>
                 <w:color w:val="3F3F3F"/>
               </w:rPr>
-              <w:t>0</w:t>
-            </w:r>
-            <w:r>
-              <w:rPr>
-                <w:rFonts w:ascii="Courier New" w:hAnsi="Courier New" w:cs="Courier New"/>
-                <w:color w:val="3F3F3F"/>
-              </w:rPr>
-              <w:t>1/2020</w:t>
-            </w:r>
-            <w:r>
-              <w:rPr>
-                <w:rFonts w:ascii="Courier New" w:hAnsi="Courier New" w:cs="Courier New"/>
-                <w:color w:val="3F3F3F"/>
-              </w:rPr>
-              <w:t>-</w:t>
+              <w:t>01/2020-</w:t>
             </w:r>
             <w:r>
               <w:rPr>
@@ -2026,21 +2010,7 @@
                 <w:rFonts w:ascii="Courier New" w:hAnsi="Courier New" w:cs="Courier New"/>
                 <w:color w:val="3F3F3F"/>
               </w:rPr>
-              <w:t>12</w:t>
-            </w:r>
-            <w:r>
-              <w:rPr>
-                <w:rFonts w:ascii="Courier New" w:hAnsi="Courier New" w:cs="Courier New"/>
-                <w:color w:val="3F3F3F"/>
-              </w:rPr>
-              <w:t>/20</w:t>
-            </w:r>
-            <w:r>
-              <w:rPr>
-                <w:rFonts w:ascii="Courier New" w:hAnsi="Courier New" w:cs="Courier New"/>
-                <w:color w:val="3F3F3F"/>
-              </w:rPr>
-              <w:t>20</w:t>
+              <w:t>12/2020</w:t>
             </w:r>
           </w:p>
         </w:tc>
@@ -2065,35 +2035,7 @@
                 <w:rFonts w:ascii="Courier New" w:hAnsi="Courier New" w:cs="Courier New"/>
                 <w:color w:val="3F3F3F"/>
               </w:rPr>
-              <w:t>Team excellent of the year 202</w:t>
-            </w:r>
-            <w:r>
-              <w:rPr>
-                <w:rFonts w:ascii="Courier New" w:hAnsi="Courier New" w:cs="Courier New"/>
-                <w:color w:val="3F3F3F"/>
-              </w:rPr>
-              <w:t>0</w:t>
-            </w:r>
-            <w:r>
-              <w:rPr>
-                <w:rFonts w:ascii="Courier New" w:hAnsi="Courier New" w:cs="Courier New"/>
-                <w:color w:val="3F3F3F"/>
-              </w:rPr>
-              <w:t xml:space="preserve"> - Onsite B</w:t>
-            </w:r>
-            <w:r>
-              <w:rPr>
-                <w:rFonts w:ascii="Courier New" w:hAnsi="Courier New" w:cs="Courier New"/>
-                <w:color w:val="3F3F3F"/>
-              </w:rPr>
-              <w:t>O</w:t>
-            </w:r>
-            <w:r>
-              <w:rPr>
-                <w:rFonts w:ascii="Courier New" w:hAnsi="Courier New" w:cs="Courier New"/>
-                <w:color w:val="3F3F3F"/>
-              </w:rPr>
-              <w:t>SCH</w:t>
+              <w:t>Team excellent of the year 2020 - Onsite BOSCH</w:t>
             </w:r>
           </w:p>
         </w:tc>
@@ -2737,63 +2679,6 @@
                 <w:szCs w:val="22"/>
               </w:rPr>
               <w:t>Technology:</w:t>
-            </w:r>
-          </w:p>
-          <w:p>
-            <w:pPr>
-              <w:pStyle w:val="ListParagraph"/>
-              <w:numPr>
-                <w:ilvl w:val="1"/>
-                <w:numId w:val="2"/>
-              </w:numPr>
-              <w:tabs>
-                <w:tab w:val="left" w:pos="1549"/>
-              </w:tabs>
-              <w:kinsoku w:val="0"/>
-              <w:overflowPunct w:val="0"/>
-              <w:rPr>
-                <w:rFonts w:ascii="Courier New" w:hAnsi="Courier New" w:cs="Courier New"/>
-                <w:color w:val="404040"/>
-                <w:sz w:val="22"/>
-                <w:szCs w:val="22"/>
-              </w:rPr>
-            </w:pPr>
-            <w:r>
-              <w:rPr>
-                <w:rFonts w:ascii="Courier New" w:hAnsi="Courier New" w:cs="Courier New"/>
-                <w:color w:val="404040"/>
-                <w:sz w:val="22"/>
-                <w:szCs w:val="22"/>
-              </w:rPr>
-              <w:t>AutoCAD,</w:t>
-            </w:r>
-            <w:r>
-              <w:rPr>
-                <w:rFonts w:ascii="Courier New" w:hAnsi="Courier New" w:cs="Courier New"/>
-                <w:color w:val="404040"/>
-                <w:spacing w:val="-5"/>
-                <w:sz w:val="22"/>
-                <w:szCs w:val="22"/>
-              </w:rPr>
-              <w:t xml:space="preserve"> </w:t>
-            </w:r>
-            <w:r>
-              <w:rPr>
-                <w:rFonts w:ascii="Courier New" w:hAnsi="Courier New" w:cs="Courier New"/>
-                <w:color w:val="404040"/>
-                <w:sz w:val="22"/>
-                <w:szCs w:val="22"/>
-              </w:rPr>
-              <w:t>Altium,</w:t>
-            </w:r>
-            <w:r>
-              <w:rPr>
-                <w:rFonts w:ascii="Courier New" w:hAnsi="Courier New" w:cs="Courier New"/>
-                <w:color w:val="404040"/>
-                <w:sz w:val="22"/>
-                <w:szCs w:val="22"/>
-              </w:rPr>
-              <w:t xml:space="preserve"> VHDL.</w:t>
             </w:r>
           </w:p>
           <w:p>
@@ -3396,9 +3281,10 @@
               <w:rPr>
                 <w:rFonts w:ascii="Courier New" w:hAnsi="Courier New" w:cs="Courier New"/>
                 <w:color w:val="404040"/>
-                <w:sz w:val="20"/>
-              </w:rPr>
-              <w:t>member</w:t>
+                <w:spacing w:val="-4"/>
+                <w:sz w:val="20"/>
+              </w:rPr>
+              <w:t>leader/sub-leader</w:t>
             </w:r>
           </w:p>
         </w:tc>
@@ -3850,6 +3736,23 @@
               </w:rPr>
               <w:t>member</w:t>
             </w:r>
+            <w:r>
+              <w:rPr>
+                <w:rFonts w:ascii="Courier New" w:hAnsi="Courier New" w:cs="Courier New"/>
+                <w:color w:val="404040"/>
+                <w:sz w:val="20"/>
+              </w:rPr>
+              <w:t>/</w:t>
+            </w:r>
+            <w:r>
+              <w:rPr>
+                <w:rFonts w:ascii="Courier New" w:hAnsi="Courier New" w:cs="Courier New"/>
+                <w:color w:val="404040"/>
+                <w:spacing w:val="-4"/>
+                <w:sz w:val="20"/>
+              </w:rPr>
+              <w:t>sub-leader</w:t>
+            </w:r>
           </w:p>
         </w:tc>
       </w:tr>
@@ -5071,7 +4974,7 @@
 </file>
 
 <file path=word/endnotes.xml><?xml version="1.0" encoding="utf-8"?>
-<w:endnotes xmlns:wpc="http://schemas.microsoft.com/office/word/2010/wordprocessingCanvas" xmlns:cx="http://schemas.microsoft.com/office/drawing/2014/chartex" xmlns:mc="http://schemas.openxmlformats.org/markup-compatibility/2006" xmlns:o="urn:schemas-microsoft-com:office:office" xmlns:r="http://schemas.openxmlformats.org/officeDocument/2006/relationships" xmlns:m="http://schemas.openxmlformats.org/officeDocument/2006/math" xmlns:v="urn:schemas-microsoft-com:vml" xmlns:wp14="http://schemas.microsoft.com/office/word/2010/wordprocessingDrawing" xmlns:wp="http://schemas.openxmlformats.org/drawingml/2006/wordprocessingDrawing" xmlns:w10="urn:schemas-microsoft-com:office:word" xmlns:w="http://schemas.openxmlformats.org/wordprocessingml/2006/main" xmlns:w14="http://schemas.microsoft.com/office/word/2010/wordml" xmlns:w15="http://schemas.microsoft.com/office/word/2012/wordml" xmlns:w16se="http://schemas.microsoft.com/office/word/2015/wordml/symex" xmlns:wpg="http://schemas.microsoft.com/office/word/2010/wordprocessingGroup" xmlns:wpi="http://schemas.microsoft.com/office/word/2010/wordprocessingInk" xmlns:wne="http://schemas.microsoft.com/office/word/2006/wordml" xmlns:wps="http://schemas.microsoft.com/office/word/2010/wordprocessingShape" mc:Ignorable="w14 w15 w16se wp14">
+<w:endnotes xmlns:wpc="http://schemas.microsoft.com/office/word/2010/wordprocessingCanvas" xmlns:cx="http://schemas.microsoft.com/office/drawing/2014/chartex" xmlns:cx1="http://schemas.microsoft.com/office/drawing/2015/9/8/chartex" xmlns:cx2="http://schemas.microsoft.com/office/drawing/2015/10/21/chartex" xmlns:cx3="http://schemas.microsoft.com/office/drawing/2016/5/9/chartex" xmlns:cx4="http://schemas.microsoft.com/office/drawing/2016/5/10/chartex" xmlns:cx5="http://schemas.microsoft.com/office/drawing/2016/5/11/chartex" xmlns:cx6="http://schemas.microsoft.com/office/drawing/2016/5/12/chartex" xmlns:cx7="http://schemas.microsoft.com/office/drawing/2016/5/13/chartex" xmlns:cx8="http://schemas.microsoft.com/office/drawing/2016/5/14/chartex" xmlns:mc="http://schemas.openxmlformats.org/markup-compatibility/2006" xmlns:aink="http://schemas.microsoft.com/office/drawing/2016/ink" xmlns:am3d="http://schemas.microsoft.com/office/drawing/2017/model3d" xmlns:o="urn:schemas-microsoft-com:office:office" xmlns:r="http://schemas.openxmlformats.org/officeDocument/2006/relationships" xmlns:m="http://schemas.openxmlformats.org/officeDocument/2006/math" xmlns:v="urn:schemas-microsoft-com:vml" xmlns:wp14="http://schemas.microsoft.com/office/word/2010/wordprocessingDrawing" xmlns:wp="http://schemas.openxmlformats.org/drawingml/2006/wordprocessingDrawing" xmlns:w10="urn:schemas-microsoft-com:office:word" xmlns:w="http://schemas.openxmlformats.org/wordprocessingml/2006/main" xmlns:w14="http://schemas.microsoft.com/office/word/2010/wordml" xmlns:w15="http://schemas.microsoft.com/office/word/2012/wordml" xmlns:w16cex="http://schemas.microsoft.com/office/word/2018/wordml/cex" xmlns:w16cid="http://schemas.microsoft.com/office/word/2016/wordml/cid" xmlns:w16="http://schemas.microsoft.com/office/word/2018/wordml" xmlns:w16se="http://schemas.microsoft.com/office/word/2015/wordml/symex" xmlns:wpg="http://schemas.microsoft.com/office/word/2010/wordprocessingGroup" xmlns:wpi="http://schemas.microsoft.com/office/word/2010/wordprocessingInk" xmlns:wne="http://schemas.microsoft.com/office/word/2006/wordml" xmlns:wps="http://schemas.microsoft.com/office/word/2010/wordprocessingShape" mc:Ignorable="w14 w15 w16se w16cid w16 w16cex wp14">
   <w:endnote w:type="separator" w:id="-1">
     <w:p>
       <w:pPr>
@@ -5096,7 +4999,7 @@
 </file>
 
 <file path=word/footer1.xml><?xml version="1.0" encoding="utf-8"?>
-<w:ftr xmlns:wpc="http://schemas.microsoft.com/office/word/2010/wordprocessingCanvas" xmlns:cx="http://schemas.microsoft.com/office/drawing/2014/chartex" xmlns:mc="http://schemas.openxmlformats.org/markup-compatibility/2006" xmlns:o="urn:schemas-microsoft-com:office:office" xmlns:r="http://schemas.openxmlformats.org/officeDocument/2006/relationships" xmlns:m="http://schemas.openxmlformats.org/officeDocument/2006/math" xmlns:v="urn:schemas-microsoft-com:vml" xmlns:wp14="http://schemas.microsoft.com/office/word/2010/wordprocessingDrawing" xmlns:wp="http://schemas.openxmlformats.org/drawingml/2006/wordprocessingDrawing" xmlns:w10="urn:schemas-microsoft-com:office:word" xmlns:w="http://schemas.openxmlformats.org/wordprocessingml/2006/main" xmlns:w14="http://schemas.microsoft.com/office/word/2010/wordml" xmlns:w15="http://schemas.microsoft.com/office/word/2012/wordml" xmlns:w16se="http://schemas.microsoft.com/office/word/2015/wordml/symex" xmlns:wpg="http://schemas.microsoft.com/office/word/2010/wordprocessingGroup" xmlns:wpi="http://schemas.microsoft.com/office/word/2010/wordprocessingInk" xmlns:wne="http://schemas.microsoft.com/office/word/2006/wordml" xmlns:wps="http://schemas.microsoft.com/office/word/2010/wordprocessingShape" mc:Ignorable="w14 w15 w16se wp14">
+<w:ftr xmlns:wpc="http://schemas.microsoft.com/office/word/2010/wordprocessingCanvas" xmlns:cx="http://schemas.microsoft.com/office/drawing/2014/chartex" xmlns:cx1="http://schemas.microsoft.com/office/drawing/2015/9/8/chartex" xmlns:cx2="http://schemas.microsoft.com/office/drawing/2015/10/21/chartex" xmlns:cx3="http://schemas.microsoft.com/office/drawing/2016/5/9/chartex" xmlns:cx4="http://schemas.microsoft.com/office/drawing/2016/5/10/chartex" xmlns:cx5="http://schemas.microsoft.com/office/drawing/2016/5/11/chartex" xmlns:cx6="http://schemas.microsoft.com/office/drawing/2016/5/12/chartex" xmlns:cx7="http://schemas.microsoft.com/office/drawing/2016/5/13/chartex" xmlns:cx8="http://schemas.microsoft.com/office/drawing/2016/5/14/chartex" xmlns:mc="http://schemas.openxmlformats.org/markup-compatibility/2006" xmlns:aink="http://schemas.microsoft.com/office/drawing/2016/ink" xmlns:am3d="http://schemas.microsoft.com/office/drawing/2017/model3d" xmlns:o="urn:schemas-microsoft-com:office:office" xmlns:r="http://schemas.openxmlformats.org/officeDocument/2006/relationships" xmlns:m="http://schemas.openxmlformats.org/officeDocument/2006/math" xmlns:v="urn:schemas-microsoft-com:vml" xmlns:wp14="http://schemas.microsoft.com/office/word/2010/wordprocessingDrawing" xmlns:wp="http://schemas.openxmlformats.org/drawingml/2006/wordprocessingDrawing" xmlns:w10="urn:schemas-microsoft-com:office:word" xmlns:w="http://schemas.openxmlformats.org/wordprocessingml/2006/main" xmlns:w14="http://schemas.microsoft.com/office/word/2010/wordml" xmlns:w15="http://schemas.microsoft.com/office/word/2012/wordml" xmlns:w16cex="http://schemas.microsoft.com/office/word/2018/wordml/cex" xmlns:w16cid="http://schemas.microsoft.com/office/word/2016/wordml/cid" xmlns:w16="http://schemas.microsoft.com/office/word/2018/wordml" xmlns:w16se="http://schemas.microsoft.com/office/word/2015/wordml/symex" xmlns:wpg="http://schemas.microsoft.com/office/word/2010/wordprocessingGroup" xmlns:wpi="http://schemas.microsoft.com/office/word/2010/wordprocessingInk" xmlns:wne="http://schemas.microsoft.com/office/word/2006/wordml" xmlns:wps="http://schemas.microsoft.com/office/word/2010/wordprocessingShape" mc:Ignorable="w14 w15 w16se w16cid w16 w16cex wp14">
   <w:tbl>
     <w:tblPr>
       <w:tblW w:w="5000" w:type="pct"/>
@@ -5222,7 +5125,7 @@
 </file>
 
 <file path=word/footnotes.xml><?xml version="1.0" encoding="utf-8"?>
-<w:footnotes xmlns:wpc="http://schemas.microsoft.com/office/word/2010/wordprocessingCanvas" xmlns:cx="http://schemas.microsoft.com/office/drawing/2014/chartex" xmlns:mc="http://schemas.openxmlformats.org/markup-compatibility/2006" xmlns:o="urn:schemas-microsoft-com:office:office" xmlns:r="http://schemas.openxmlformats.org/officeDocument/2006/relationships" xmlns:m="http://schemas.openxmlformats.org/officeDocument/2006/math" xmlns:v="urn:schemas-microsoft-com:vml" xmlns:wp14="http://schemas.microsoft.com/office/word/2010/wordprocessingDrawing" xmlns:wp="http://schemas.openxmlformats.org/drawingml/2006/wordprocessingDrawing" xmlns:w10="urn:schemas-microsoft-com:office:word" xmlns:w="http://schemas.openxmlformats.org/wordprocessingml/2006/main" xmlns:w14="http://schemas.microsoft.com/office/word/2010/wordml" xmlns:w15="http://schemas.microsoft.com/office/word/2012/wordml" xmlns:w16se="http://schemas.microsoft.com/office/word/2015/wordml/symex" xmlns:wpg="http://schemas.microsoft.com/office/word/2010/wordprocessingGroup" xmlns:wpi="http://schemas.microsoft.com/office/word/2010/wordprocessingInk" xmlns:wne="http://schemas.microsoft.com/office/word/2006/wordml" xmlns:wps="http://schemas.microsoft.com/office/word/2010/wordprocessingShape" mc:Ignorable="w14 w15 w16se wp14">
+<w:footnotes xmlns:wpc="http://schemas.microsoft.com/office/word/2010/wordprocessingCanvas" xmlns:cx="http://schemas.microsoft.com/office/drawing/2014/chartex" xmlns:cx1="http://schemas.microsoft.com/office/drawing/2015/9/8/chartex" xmlns:cx2="http://schemas.microsoft.com/office/drawing/2015/10/21/chartex" xmlns:cx3="http://schemas.microsoft.com/office/drawing/2016/5/9/chartex" xmlns:cx4="http://schemas.microsoft.com/office/drawing/2016/5/10/chartex" xmlns:cx5="http://schemas.microsoft.com/office/drawing/2016/5/11/chartex" xmlns:cx6="http://schemas.microsoft.com/office/drawing/2016/5/12/chartex" xmlns:cx7="http://schemas.microsoft.com/office/drawing/2016/5/13/chartex" xmlns:cx8="http://schemas.microsoft.com/office/drawing/2016/5/14/chartex" xmlns:mc="http://schemas.openxmlformats.org/markup-compatibility/2006" xmlns:aink="http://schemas.microsoft.com/office/drawing/2016/ink" xmlns:am3d="http://schemas.microsoft.com/office/drawing/2017/model3d" xmlns:o="urn:schemas-microsoft-com:office:office" xmlns:r="http://schemas.openxmlformats.org/officeDocument/2006/relationships" xmlns:m="http://schemas.openxmlformats.org/officeDocument/2006/math" xmlns:v="urn:schemas-microsoft-com:vml" xmlns:wp14="http://schemas.microsoft.com/office/word/2010/wordprocessingDrawing" xmlns:wp="http://schemas.openxmlformats.org/drawingml/2006/wordprocessingDrawing" xmlns:w10="urn:schemas-microsoft-com:office:word" xmlns:w="http://schemas.openxmlformats.org/wordprocessingml/2006/main" xmlns:w14="http://schemas.microsoft.com/office/word/2010/wordml" xmlns:w15="http://schemas.microsoft.com/office/word/2012/wordml" xmlns:w16cex="http://schemas.microsoft.com/office/word/2018/wordml/cex" xmlns:w16cid="http://schemas.microsoft.com/office/word/2016/wordml/cid" xmlns:w16="http://schemas.microsoft.com/office/word/2018/wordml" xmlns:w16se="http://schemas.microsoft.com/office/word/2015/wordml/symex" xmlns:wpg="http://schemas.microsoft.com/office/word/2010/wordprocessingGroup" xmlns:wpi="http://schemas.microsoft.com/office/word/2010/wordprocessingInk" xmlns:wne="http://schemas.microsoft.com/office/word/2006/wordml" xmlns:wps="http://schemas.microsoft.com/office/word/2010/wordprocessingShape" mc:Ignorable="w14 w15 w16se w16cid w16 w16cex wp14">
   <w:footnote w:type="separator" w:id="-1">
     <w:p>
       <w:pPr>
@@ -5247,7 +5150,7 @@
 </file>
 
 <file path=word/numbering.xml><?xml version="1.0" encoding="utf-8"?>
-<w:numbering xmlns:wpc="http://schemas.microsoft.com/office/word/2010/wordprocessingCanvas" xmlns:cx="http://schemas.microsoft.com/office/drawing/2014/chartex" xmlns:mc="http://schemas.openxmlformats.org/markup-compatibility/2006" xmlns:o="urn:schemas-microsoft-com:office:office" xmlns:r="http://schemas.openxmlformats.org/officeDocument/2006/relationships" xmlns:m="http://schemas.openxmlformats.org/officeDocument/2006/math" xmlns:v="urn:schemas-microsoft-com:vml" xmlns:wp14="http://schemas.microsoft.com/office/word/2010/wordprocessingDrawing" xmlns:wp="http://schemas.openxmlformats.org/drawingml/2006/wordprocessingDrawing" xmlns:w10="urn:schemas-microsoft-com:office:word" xmlns:w="http://schemas.openxmlformats.org/wordprocessingml/2006/main" xmlns:w14="http://schemas.microsoft.com/office/word/2010/wordml" xmlns:w15="http://schemas.microsoft.com/office/word/2012/wordml" xmlns:w16se="http://schemas.microsoft.com/office/word/2015/wordml/symex" xmlns:wpg="http://schemas.microsoft.com/office/word/2010/wordprocessingGroup" xmlns:wpi="http://schemas.microsoft.com/office/word/2010/wordprocessingInk" xmlns:wne="http://schemas.microsoft.com/office/word/2006/wordml" xmlns:wps="http://schemas.microsoft.com/office/word/2010/wordprocessingShape" mc:Ignorable="w14 w15 w16se wp14">
+<w:numbering xmlns:wpc="http://schemas.microsoft.com/office/word/2010/wordprocessingCanvas" xmlns:cx="http://schemas.microsoft.com/office/drawing/2014/chartex" xmlns:cx1="http://schemas.microsoft.com/office/drawing/2015/9/8/chartex" xmlns:cx2="http://schemas.microsoft.com/office/drawing/2015/10/21/chartex" xmlns:cx3="http://schemas.microsoft.com/office/drawing/2016/5/9/chartex" xmlns:cx4="http://schemas.microsoft.com/office/drawing/2016/5/10/chartex" xmlns:cx5="http://schemas.microsoft.com/office/drawing/2016/5/11/chartex" xmlns:cx6="http://schemas.microsoft.com/office/drawing/2016/5/12/chartex" xmlns:cx7="http://schemas.microsoft.com/office/drawing/2016/5/13/chartex" xmlns:cx8="http://schemas.microsoft.com/office/drawing/2016/5/14/chartex" xmlns:mc="http://schemas.openxmlformats.org/markup-compatibility/2006" xmlns:aink="http://schemas.microsoft.com/office/drawing/2016/ink" xmlns:am3d="http://schemas.microsoft.com/office/drawing/2017/model3d" xmlns:o="urn:schemas-microsoft-com:office:office" xmlns:r="http://schemas.openxmlformats.org/officeDocument/2006/relationships" xmlns:m="http://schemas.openxmlformats.org/officeDocument/2006/math" xmlns:v="urn:schemas-microsoft-com:vml" xmlns:wp14="http://schemas.microsoft.com/office/word/2010/wordprocessingDrawing" xmlns:wp="http://schemas.openxmlformats.org/drawingml/2006/wordprocessingDrawing" xmlns:w10="urn:schemas-microsoft-com:office:word" xmlns:w="http://schemas.openxmlformats.org/wordprocessingml/2006/main" xmlns:w14="http://schemas.microsoft.com/office/word/2010/wordml" xmlns:w15="http://schemas.microsoft.com/office/word/2012/wordml" xmlns:w16cex="http://schemas.microsoft.com/office/word/2018/wordml/cex" xmlns:w16cid="http://schemas.microsoft.com/office/word/2016/wordml/cid" xmlns:w16="http://schemas.microsoft.com/office/word/2018/wordml" xmlns:w16se="http://schemas.microsoft.com/office/word/2015/wordml/symex" xmlns:wpg="http://schemas.microsoft.com/office/word/2010/wordprocessingGroup" xmlns:wpi="http://schemas.microsoft.com/office/word/2010/wordprocessingInk" xmlns:wne="http://schemas.microsoft.com/office/word/2006/wordml" xmlns:wps="http://schemas.microsoft.com/office/word/2010/wordprocessingShape" mc:Ignorable="w14 w15 w16se w16cid w16 w16cex wp14">
   <w:abstractNum w:abstractNumId="0" w15:restartNumberingAfterBreak="0">
     <w:nsid w:val="00000402"/>
     <w:multiLevelType w:val="multilevel"/>
@@ -5471,7 +5374,7 @@
 </file>
 
 <file path=word/styles.xml><?xml version="1.0" encoding="utf-8"?>
-<w:styles xmlns:mc="http://schemas.openxmlformats.org/markup-compatibility/2006" xmlns:r="http://schemas.openxmlformats.org/officeDocument/2006/relationships" xmlns:w="http://schemas.openxmlformats.org/wordprocessingml/2006/main" xmlns:w14="http://schemas.microsoft.com/office/word/2010/wordml" xmlns:w15="http://schemas.microsoft.com/office/word/2012/wordml" xmlns:w16se="http://schemas.microsoft.com/office/word/2015/wordml/symex" mc:Ignorable="w14 w15 w16se">
+<w:styles xmlns:mc="http://schemas.openxmlformats.org/markup-compatibility/2006" xmlns:r="http://schemas.openxmlformats.org/officeDocument/2006/relationships" xmlns:w="http://schemas.openxmlformats.org/wordprocessingml/2006/main" xmlns:w14="http://schemas.microsoft.com/office/word/2010/wordml" xmlns:w15="http://schemas.microsoft.com/office/word/2012/wordml" xmlns:w16cex="http://schemas.microsoft.com/office/word/2018/wordml/cex" xmlns:w16cid="http://schemas.microsoft.com/office/word/2016/wordml/cid" xmlns:w16="http://schemas.microsoft.com/office/word/2018/wordml" xmlns:w16se="http://schemas.microsoft.com/office/word/2015/wordml/symex" mc:Ignorable="w14 w15 w16se w16cid w16 w16cex">
   <w:docDefaults>
     <w:rPrDefault>
       <w:rPr>
@@ -5487,7 +5390,7 @@
       </w:pPr>
     </w:pPrDefault>
   </w:docDefaults>
-  <w:latentStyles w:defLockedState="0" w:defUIPriority="99" w:defSemiHidden="0" w:defUnhideWhenUsed="0" w:defQFormat="0" w:count="371">
+  <w:latentStyles w:defLockedState="0" w:defUIPriority="99" w:defSemiHidden="0" w:defUnhideWhenUsed="0" w:defQFormat="0" w:count="376">
     <w:lsdException w:name="Normal" w:uiPriority="0" w:qFormat="1"/>
     <w:lsdException w:name="heading 1" w:uiPriority="1" w:qFormat="1"/>
     <w:lsdException w:name="heading 2" w:semiHidden="1" w:uiPriority="9" w:unhideWhenUsed="1" w:qFormat="1"/>
@@ -5593,7 +5496,6 @@
     <w:lsdException w:name="HTML Sample" w:semiHidden="1" w:unhideWhenUsed="1"/>
     <w:lsdException w:name="HTML Typewriter" w:semiHidden="1" w:unhideWhenUsed="1"/>
     <w:lsdException w:name="HTML Variable" w:semiHidden="1" w:unhideWhenUsed="1"/>
-    <w:lsdException w:name="Normal Table" w:semiHidden="1" w:unhideWhenUsed="1"/>
     <w:lsdException w:name="annotation subject" w:semiHidden="1" w:unhideWhenUsed="1"/>
     <w:lsdException w:name="No List" w:semiHidden="1" w:unhideWhenUsed="1"/>
     <w:lsdException w:name="Outline List 1" w:semiHidden="1" w:unhideWhenUsed="1"/>
@@ -5636,11 +5538,8 @@
     <w:lsdException w:name="Table Contemporary" w:semiHidden="1" w:unhideWhenUsed="1"/>
     <w:lsdException w:name="Table Elegant" w:semiHidden="1" w:unhideWhenUsed="1"/>
     <w:lsdException w:name="Table Professional" w:semiHidden="1" w:unhideWhenUsed="1"/>
-    <w:lsdException w:name="Table Subtle 1" w:semiHidden="1" w:unhideWhenUsed="1"/>
     <w:lsdException w:name="Table Subtle 2" w:semiHidden="1" w:unhideWhenUsed="1"/>
     <w:lsdException w:name="Table Web 1" w:semiHidden="1" w:unhideWhenUsed="1"/>
-    <w:lsdException w:name="Table Web 2" w:semiHidden="1" w:unhideWhenUsed="1"/>
-    <w:lsdException w:name="Table Web 3" w:semiHidden="1" w:unhideWhenUsed="1"/>
     <w:lsdException w:name="Balloon Text" w:semiHidden="1" w:unhideWhenUsed="1"/>
     <w:lsdException w:name="Table Grid" w:uiPriority="39"/>
     <w:lsdException w:name="Table Theme" w:semiHidden="1" w:unhideWhenUsed="1"/>
@@ -5859,6 +5758,11 @@
     <w:lsdException w:name="List Table 5 Dark Accent 6" w:uiPriority="50"/>
     <w:lsdException w:name="List Table 6 Colorful Accent 6" w:uiPriority="51"/>
     <w:lsdException w:name="List Table 7 Colorful Accent 6" w:uiPriority="52"/>
+    <w:lsdException w:name="Mention" w:semiHidden="1" w:unhideWhenUsed="1"/>
+    <w:lsdException w:name="Smart Hyperlink" w:semiHidden="1" w:unhideWhenUsed="1"/>
+    <w:lsdException w:name="Hashtag" w:semiHidden="1" w:unhideWhenUsed="1"/>
+    <w:lsdException w:name="Unresolved Mention" w:semiHidden="1" w:unhideWhenUsed="1"/>
+    <w:lsdException w:name="Smart Link" w:semiHidden="1" w:unhideWhenUsed="1"/>
   </w:latentStyles>
   <w:style w:type="paragraph" w:default="1" w:styleId="Normal">
     <w:name w:val="Normal"/>
@@ -6461,7 +6365,7 @@
 </file>
 
 <file path=word/glossary/document.xml><?xml version="1.0" encoding="utf-8"?>
-<w:glossaryDocument xmlns:wpc="http://schemas.microsoft.com/office/word/2010/wordprocessingCanvas" xmlns:cx="http://schemas.microsoft.com/office/drawing/2014/chartex" xmlns:mc="http://schemas.openxmlformats.org/markup-compatibility/2006" xmlns:o="urn:schemas-microsoft-com:office:office" xmlns:r="http://schemas.openxmlformats.org/officeDocument/2006/relationships" xmlns:m="http://schemas.openxmlformats.org/officeDocument/2006/math" xmlns:v="urn:schemas-microsoft-com:vml" xmlns:wp14="http://schemas.microsoft.com/office/word/2010/wordprocessingDrawing" xmlns:wp="http://schemas.openxmlformats.org/drawingml/2006/wordprocessingDrawing" xmlns:w10="urn:schemas-microsoft-com:office:word" xmlns:w="http://schemas.openxmlformats.org/wordprocessingml/2006/main" xmlns:w14="http://schemas.microsoft.com/office/word/2010/wordml" xmlns:w15="http://schemas.microsoft.com/office/word/2012/wordml" xmlns:w16se="http://schemas.microsoft.com/office/word/2015/wordml/symex" xmlns:wpg="http://schemas.microsoft.com/office/word/2010/wordprocessingGroup" xmlns:wpi="http://schemas.microsoft.com/office/word/2010/wordprocessingInk" xmlns:wne="http://schemas.microsoft.com/office/word/2006/wordml" xmlns:wps="http://schemas.microsoft.com/office/word/2010/wordprocessingShape" mc:Ignorable="w14 w15 w16se wp14">
+<w:glossaryDocument xmlns:wpc="http://schemas.microsoft.com/office/word/2010/wordprocessingCanvas" xmlns:cx="http://schemas.microsoft.com/office/drawing/2014/chartex" xmlns:cx1="http://schemas.microsoft.com/office/drawing/2015/9/8/chartex" xmlns:cx2="http://schemas.microsoft.com/office/drawing/2015/10/21/chartex" xmlns:cx3="http://schemas.microsoft.com/office/drawing/2016/5/9/chartex" xmlns:cx4="http://schemas.microsoft.com/office/drawing/2016/5/10/chartex" xmlns:cx5="http://schemas.microsoft.com/office/drawing/2016/5/11/chartex" xmlns:cx6="http://schemas.microsoft.com/office/drawing/2016/5/12/chartex" xmlns:cx7="http://schemas.microsoft.com/office/drawing/2016/5/13/chartex" xmlns:cx8="http://schemas.microsoft.com/office/drawing/2016/5/14/chartex" xmlns:mc="http://schemas.openxmlformats.org/markup-compatibility/2006" xmlns:aink="http://schemas.microsoft.com/office/drawing/2016/ink" xmlns:am3d="http://schemas.microsoft.com/office/drawing/2017/model3d" xmlns:o="urn:schemas-microsoft-com:office:office" xmlns:r="http://schemas.openxmlformats.org/officeDocument/2006/relationships" xmlns:m="http://schemas.openxmlformats.org/officeDocument/2006/math" xmlns:v="urn:schemas-microsoft-com:vml" xmlns:wp14="http://schemas.microsoft.com/office/word/2010/wordprocessingDrawing" xmlns:wp="http://schemas.openxmlformats.org/drawingml/2006/wordprocessingDrawing" xmlns:w10="urn:schemas-microsoft-com:office:word" xmlns:w="http://schemas.openxmlformats.org/wordprocessingml/2006/main" xmlns:w14="http://schemas.microsoft.com/office/word/2010/wordml" xmlns:w15="http://schemas.microsoft.com/office/word/2012/wordml" xmlns:w16cex="http://schemas.microsoft.com/office/word/2018/wordml/cex" xmlns:w16cid="http://schemas.microsoft.com/office/word/2016/wordml/cid" xmlns:w16="http://schemas.microsoft.com/office/word/2018/wordml" xmlns:w16se="http://schemas.microsoft.com/office/word/2015/wordml/symex" xmlns:wpg="http://schemas.microsoft.com/office/word/2010/wordprocessingGroup" xmlns:wpi="http://schemas.microsoft.com/office/word/2010/wordprocessingInk" xmlns:wne="http://schemas.microsoft.com/office/word/2006/wordml" xmlns:wps="http://schemas.microsoft.com/office/word/2010/wordprocessingShape" mc:Ignorable="w14 w15 w16se w16cid w16 w16cex wp14">
   <w:docParts>
     <w:docPart>
       <w:docPartPr>
@@ -6498,7 +6402,7 @@
 </file>
 
 <file path=word/glossary/fontTable.xml><?xml version="1.0" encoding="utf-8"?>
-<w:fonts xmlns:mc="http://schemas.openxmlformats.org/markup-compatibility/2006" xmlns:r="http://schemas.openxmlformats.org/officeDocument/2006/relationships" xmlns:w="http://schemas.openxmlformats.org/wordprocessingml/2006/main" xmlns:w14="http://schemas.microsoft.com/office/word/2010/wordml" xmlns:w15="http://schemas.microsoft.com/office/word/2012/wordml" xmlns:w16se="http://schemas.microsoft.com/office/word/2015/wordml/symex" mc:Ignorable="w14 w15 w16se">
+<w:fonts xmlns:mc="http://schemas.openxmlformats.org/markup-compatibility/2006" xmlns:r="http://schemas.openxmlformats.org/officeDocument/2006/relationships" xmlns:w="http://schemas.openxmlformats.org/wordprocessingml/2006/main" xmlns:w14="http://schemas.microsoft.com/office/word/2010/wordml" xmlns:w15="http://schemas.microsoft.com/office/word/2012/wordml" xmlns:w16cex="http://schemas.microsoft.com/office/word/2018/wordml/cex" xmlns:w16cid="http://schemas.microsoft.com/office/word/2016/wordml/cid" xmlns:w16="http://schemas.microsoft.com/office/word/2018/wordml" xmlns:w16se="http://schemas.microsoft.com/office/word/2015/wordml/symex" mc:Ignorable="w14 w15 w16se w16cid w16 w16cex">
   <w:font w:name="Times New Roman">
     <w:panose1 w:val="02020603050405020304"/>
     <w:charset w:val="00"/>
@@ -6552,7 +6456,7 @@
 </file>
 
 <file path=word/glossary/settings.xml><?xml version="1.0" encoding="utf-8"?>
-<w:settings xmlns:mc="http://schemas.openxmlformats.org/markup-compatibility/2006" xmlns:o="urn:schemas-microsoft-com:office:office" xmlns:r="http://schemas.openxmlformats.org/officeDocument/2006/relationships" xmlns:m="http://schemas.openxmlformats.org/officeDocument/2006/math" xmlns:v="urn:schemas-microsoft-com:vml" xmlns:w10="urn:schemas-microsoft-com:office:word" xmlns:w="http://schemas.openxmlformats.org/wordprocessingml/2006/main" xmlns:w14="http://schemas.microsoft.com/office/word/2010/wordml" xmlns:w15="http://schemas.microsoft.com/office/word/2012/wordml" xmlns:w16se="http://schemas.microsoft.com/office/word/2015/wordml/symex" xmlns:sl="http://schemas.openxmlformats.org/schemaLibrary/2006/main" mc:Ignorable="w14 w15 w16se">
+<w:settings xmlns:mc="http://schemas.openxmlformats.org/markup-compatibility/2006" xmlns:o="urn:schemas-microsoft-com:office:office" xmlns:r="http://schemas.openxmlformats.org/officeDocument/2006/relationships" xmlns:m="http://schemas.openxmlformats.org/officeDocument/2006/math" xmlns:v="urn:schemas-microsoft-com:vml" xmlns:w10="urn:schemas-microsoft-com:office:word" xmlns:w="http://schemas.openxmlformats.org/wordprocessingml/2006/main" xmlns:w14="http://schemas.microsoft.com/office/word/2010/wordml" xmlns:w15="http://schemas.microsoft.com/office/word/2012/wordml" xmlns:w16cex="http://schemas.microsoft.com/office/word/2018/wordml/cex" xmlns:w16cid="http://schemas.microsoft.com/office/word/2016/wordml/cid" xmlns:w16="http://schemas.microsoft.com/office/word/2018/wordml" xmlns:w16se="http://schemas.microsoft.com/office/word/2015/wordml/symex" xmlns:sl="http://schemas.openxmlformats.org/schemaLibrary/2006/main" mc:Ignorable="w14 w15 w16se w16cid w16 w16cex">
   <w:view w:val="normal"/>
   <w:defaultTabStop w:val="720"/>
   <w:characterSpacingControl w:val="doNotCompress"/>
@@ -6563,6 +6467,7 @@
     <w:compatSetting w:name="enableOpenTypeFeatures" w:uri="http://schemas.microsoft.com/office/word" w:val="1"/>
     <w:compatSetting w:name="doNotFlipMirrorIndents" w:uri="http://schemas.microsoft.com/office/word" w:val="1"/>
     <w:compatSetting w:name="differentiateMultirowTableHeaders" w:uri="http://schemas.microsoft.com/office/word" w:val="1"/>
+    <w:compatSetting w:name="useWord2013TrackBottomHyphenation" w:uri="http://schemas.microsoft.com/office/word" w:val="1"/>
   </w:compat>
   <w:rsids>
     <w:rsidRoot w:val="00393406"/>
@@ -6570,6 +6475,7 @@
     <w:rsid w:val="00785731"/>
     <w:rsid w:val="00833B13"/>
     <w:rsid w:val="00872513"/>
+    <w:rsid w:val="00ED64EC"/>
   </w:rsids>
   <m:mathPr>
     <m:mathFont m:val="Cambria Math"/>
@@ -6593,7 +6499,7 @@
 </file>
 
 <file path=word/glossary/styles.xml><?xml version="1.0" encoding="utf-8"?>
-<w:styles xmlns:mc="http://schemas.openxmlformats.org/markup-compatibility/2006" xmlns:r="http://schemas.openxmlformats.org/officeDocument/2006/relationships" xmlns:w="http://schemas.openxmlformats.org/wordprocessingml/2006/main" xmlns:w14="http://schemas.microsoft.com/office/word/2010/wordml" xmlns:w15="http://schemas.microsoft.com/office/word/2012/wordml" xmlns:w16se="http://schemas.microsoft.com/office/word/2015/wordml/symex" mc:Ignorable="w14 w15 w16se">
+<w:styles xmlns:mc="http://schemas.openxmlformats.org/markup-compatibility/2006" xmlns:r="http://schemas.openxmlformats.org/officeDocument/2006/relationships" xmlns:w="http://schemas.openxmlformats.org/wordprocessingml/2006/main" xmlns:w14="http://schemas.microsoft.com/office/word/2010/wordml" xmlns:w15="http://schemas.microsoft.com/office/word/2012/wordml" xmlns:w16cex="http://schemas.microsoft.com/office/word/2018/wordml/cex" xmlns:w16cid="http://schemas.microsoft.com/office/word/2016/wordml/cid" xmlns:w16="http://schemas.microsoft.com/office/word/2018/wordml" xmlns:w16se="http://schemas.microsoft.com/office/word/2015/wordml/symex" mc:Ignorable="w14 w15 w16se w16cid w16 w16cex">
   <w:docDefaults>
     <w:rPrDefault>
       <w:rPr>
@@ -6609,7 +6515,7 @@
       </w:pPr>
     </w:pPrDefault>
   </w:docDefaults>
-  <w:latentStyles w:defLockedState="0" w:defUIPriority="99" w:defSemiHidden="0" w:defUnhideWhenUsed="0" w:defQFormat="0" w:count="371">
+  <w:latentStyles w:defLockedState="0" w:defUIPriority="99" w:defSemiHidden="0" w:defUnhideWhenUsed="0" w:defQFormat="0" w:count="376">
     <w:lsdException w:name="Normal" w:uiPriority="0" w:qFormat="1"/>
     <w:lsdException w:name="heading 1" w:uiPriority="9" w:qFormat="1"/>
     <w:lsdException w:name="heading 2" w:semiHidden="1" w:uiPriority="9" w:unhideWhenUsed="1" w:qFormat="1"/>
@@ -6715,7 +6621,6 @@
     <w:lsdException w:name="HTML Sample" w:semiHidden="1" w:unhideWhenUsed="1"/>
     <w:lsdException w:name="HTML Typewriter" w:semiHidden="1" w:unhideWhenUsed="1"/>
     <w:lsdException w:name="HTML Variable" w:semiHidden="1" w:unhideWhenUsed="1"/>
-    <w:lsdException w:name="Normal Table" w:semiHidden="1" w:unhideWhenUsed="1"/>
     <w:lsdException w:name="annotation subject" w:semiHidden="1" w:unhideWhenUsed="1"/>
     <w:lsdException w:name="No List" w:semiHidden="1" w:unhideWhenUsed="1"/>
     <w:lsdException w:name="Outline List 1" w:semiHidden="1" w:unhideWhenUsed="1"/>
@@ -6758,11 +6663,8 @@
     <w:lsdException w:name="Table Contemporary" w:semiHidden="1" w:unhideWhenUsed="1"/>
     <w:lsdException w:name="Table Elegant" w:semiHidden="1" w:unhideWhenUsed="1"/>
     <w:lsdException w:name="Table Professional" w:semiHidden="1" w:unhideWhenUsed="1"/>
-    <w:lsdException w:name="Table Subtle 1" w:semiHidden="1" w:unhideWhenUsed="1"/>
     <w:lsdException w:name="Table Subtle 2" w:semiHidden="1" w:unhideWhenUsed="1"/>
     <w:lsdException w:name="Table Web 1" w:semiHidden="1" w:unhideWhenUsed="1"/>
-    <w:lsdException w:name="Table Web 2" w:semiHidden="1" w:unhideWhenUsed="1"/>
-    <w:lsdException w:name="Table Web 3" w:semiHidden="1" w:unhideWhenUsed="1"/>
     <w:lsdException w:name="Balloon Text" w:semiHidden="1" w:unhideWhenUsed="1"/>
     <w:lsdException w:name="Table Grid" w:uiPriority="39"/>
     <w:lsdException w:name="Table Theme" w:semiHidden="1" w:unhideWhenUsed="1"/>
@@ -6981,6 +6883,11 @@
     <w:lsdException w:name="List Table 5 Dark Accent 6" w:uiPriority="50"/>
     <w:lsdException w:name="List Table 6 Colorful Accent 6" w:uiPriority="51"/>
     <w:lsdException w:name="List Table 7 Colorful Accent 6" w:uiPriority="52"/>
+    <w:lsdException w:name="Mention" w:semiHidden="1" w:unhideWhenUsed="1"/>
+    <w:lsdException w:name="Smart Hyperlink" w:semiHidden="1" w:unhideWhenUsed="1"/>
+    <w:lsdException w:name="Hashtag" w:semiHidden="1" w:unhideWhenUsed="1"/>
+    <w:lsdException w:name="Unresolved Mention" w:semiHidden="1" w:unhideWhenUsed="1"/>
+    <w:lsdException w:name="Smart Link" w:semiHidden="1" w:unhideWhenUsed="1"/>
   </w:latentStyles>
   <w:style w:type="paragraph" w:default="1" w:styleId="Normal">
     <w:name w:val="Normal"/>
@@ -7017,15 +6924,11 @@
     <w:name w:val="D91507D31CE4473792678917501EBB44"/>
     <w:rsid w:val="00393406"/>
   </w:style>
-  <w:style w:type="paragraph" w:customStyle="1" w:styleId="27B0C08CC86C486ABB53E5B42E33E98A">
-    <w:name w:val="27B0C08CC86C486ABB53E5B42E33E98A"/>
-    <w:rsid w:val="00393406"/>
-  </w:style>
 </w:styles>
 </file>
 
 <file path=word/glossary/webSettings.xml><?xml version="1.0" encoding="utf-8"?>
-<w:webSettings xmlns:mc="http://schemas.openxmlformats.org/markup-compatibility/2006" xmlns:r="http://schemas.openxmlformats.org/officeDocument/2006/relationships" xmlns:w="http://schemas.openxmlformats.org/wordprocessingml/2006/main" xmlns:w14="http://schemas.microsoft.com/office/word/2010/wordml" xmlns:w15="http://schemas.microsoft.com/office/word/2012/wordml" xmlns:w16se="http://schemas.microsoft.com/office/word/2015/wordml/symex" mc:Ignorable="w14 w15 w16se">
+<w:webSettings xmlns:mc="http://schemas.openxmlformats.org/markup-compatibility/2006" xmlns:r="http://schemas.openxmlformats.org/officeDocument/2006/relationships" xmlns:w="http://schemas.openxmlformats.org/wordprocessingml/2006/main" xmlns:w14="http://schemas.microsoft.com/office/word/2010/wordml" xmlns:w15="http://schemas.microsoft.com/office/word/2012/wordml" xmlns:w16cex="http://schemas.microsoft.com/office/word/2018/wordml/cex" xmlns:w16cid="http://schemas.microsoft.com/office/word/2016/wordml/cid" xmlns:w16="http://schemas.microsoft.com/office/word/2018/wordml" xmlns:w16se="http://schemas.microsoft.com/office/word/2015/wordml/symex" mc:Ignorable="w14 w15 w16se w16cid w16 w16cex">
   <w:optimizeForBrowser/>
   <w:allowPNG/>
 </w:webSettings>

</xml_diff>